<commit_message>
Update of Solara and Pull Back Strategy Functional Specifications
</commit_message>
<xml_diff>
--- a/MRSTS - Functional Specification.docx
+++ b/MRSTS - Functional Specification.docx
@@ -82,15 +82,7 @@
         <w:t>Target Platform:</w:t>
       </w:r>
       <w:r>
-        <w:t> </w:t>
-      </w:r>
-      <w:proofErr w:type="spellStart"/>
-      <w:r>
-        <w:t>MetaTrader</w:t>
-      </w:r>
-      <w:proofErr w:type="spellEnd"/>
-      <w:r>
-        <w:t xml:space="preserve"> 5</w:t>
+        <w:t> MetaTrader 5</w:t>
       </w:r>
       <w:r>
         <w:br/>
@@ -122,7 +114,7 @@
     <w:p>
       <w:r>
         <w:pict w14:anchorId="071C4430">
-          <v:rect id="_x0000_i1231" style="width:0;height:.75pt" o:hralign="center" o:hrstd="t" o:hr="t" fillcolor="#a0a0a0" stroked="f"/>
+          <v:rect id="_x0000_i1025" style="width:0;height:.75pt" o:hralign="center" o:hrstd="t" o:hr="t" fillcolor="#a0a0a0" stroked="f"/>
         </w:pict>
       </w:r>
     </w:p>
@@ -262,7 +254,7 @@
     <w:p>
       <w:r>
         <w:pict w14:anchorId="6270AB6B">
-          <v:rect id="_x0000_i1232" style="width:0;height:.75pt" o:hralign="center" o:hrstd="t" o:hr="t" fillcolor="#a0a0a0" stroked="f"/>
+          <v:rect id="_x0000_i1026" style="width:0;height:.75pt" o:hralign="center" o:hrstd="t" o:hr="t" fillcolor="#a0a0a0" stroked="f"/>
         </w:pict>
       </w:r>
     </w:p>
@@ -505,7 +497,7 @@
     <w:p>
       <w:r>
         <w:pict w14:anchorId="176D1ABD">
-          <v:rect id="_x0000_i1233" style="width:0;height:.75pt" o:hralign="center" o:hrstd="t" o:hr="t" fillcolor="#a0a0a0" stroked="f"/>
+          <v:rect id="_x0000_i1027" style="width:0;height:.75pt" o:hralign="center" o:hrstd="t" o:hr="t" fillcolor="#a0a0a0" stroked="f"/>
         </w:pict>
       </w:r>
     </w:p>
@@ -583,15 +575,7 @@
         </w:numPr>
       </w:pPr>
       <w:r>
-        <w:t xml:space="preserve">We use strict rules to decide when to enter, when to exit, and how much </w:t>
-      </w:r>
-      <w:proofErr w:type="gramStart"/>
-      <w:r>
-        <w:t>to risk</w:t>
-      </w:r>
-      <w:proofErr w:type="gramEnd"/>
-      <w:r>
-        <w:t>.</w:t>
+        <w:t>We use strict rules to decide when to enter, when to exit, and how much to risk.</w:t>
       </w:r>
     </w:p>
     <w:p>
@@ -1034,21 +1018,25 @@
     </w:p>
     <w:p>
       <w:r>
-        <w:t xml:space="preserve">Every day, the system checks 14 forex pairs on the Daily chart to see if they're in the right market conditions (not too choppy, not too </w:t>
-      </w:r>
-      <w:proofErr w:type="gramStart"/>
-      <w:r>
-        <w:t>trending</w:t>
-      </w:r>
-      <w:proofErr w:type="gramEnd"/>
-      <w:r>
-        <w:t>). For pairs that pass this filter, the system then checks every 4 hours to see if the price has dropped below its normal range AND shows signs of bouncing back. When both conditions are met, the system buys, expecting the price to return to its average over the next 5-15 days.</w:t>
+        <w:t xml:space="preserve">Every day, the system checks </w:t>
+      </w:r>
+      <w:r>
+        <w:t xml:space="preserve">listed </w:t>
+      </w:r>
+      <w:r>
+        <w:t xml:space="preserve">forex pairs </w:t>
+      </w:r>
+      <w:r>
+        <w:t xml:space="preserve">(from symbols.mqh) </w:t>
+      </w:r>
+      <w:r>
+        <w:t>on the Daily chart to see if they're in the right market conditions (not too choppy, not too trending). For pairs that pass this filter, the system then checks every 4 hours to see if the price has dropped below its normal range AND shows signs of bouncing back. When both conditions are met, the system buys, expecting the price to return to its average over the next 5-15 days.</w:t>
       </w:r>
     </w:p>
     <w:p>
       <w:r>
         <w:pict w14:anchorId="4FA78998">
-          <v:rect id="_x0000_i1234" style="width:0;height:.75pt" o:hralign="center" o:hrstd="t" o:hr="t" fillcolor="#a0a0a0" stroked="f"/>
+          <v:rect id="_x0000_i1028" style="width:0;height:.75pt" o:hralign="center" o:hrstd="t" o:hr="t" fillcolor="#a0a0a0" stroked="f"/>
         </w:pict>
       </w:r>
     </w:p>
@@ -1113,13 +1101,8 @@
           <w:numId w:val="106"/>
         </w:numPr>
       </w:pPr>
-      <w:proofErr w:type="gramStart"/>
-      <w:r>
-        <w:t>Runs</w:t>
-      </w:r>
-      <w:proofErr w:type="gramEnd"/>
-      <w:r>
-        <w:t xml:space="preserve"> once per day.</w:t>
+      <w:r>
+        <w:t>Runs once per day.</w:t>
       </w:r>
     </w:p>
     <w:p>
@@ -1140,14 +1123,9 @@
           <w:numId w:val="106"/>
         </w:numPr>
       </w:pPr>
-      <w:proofErr w:type="gramStart"/>
       <w:r>
         <w:lastRenderedPageBreak/>
-        <w:t>Decides</w:t>
-      </w:r>
-      <w:proofErr w:type="gramEnd"/>
-      <w:r>
-        <w:t>: "Which pairs are safe to trade today?".</w:t>
+        <w:t>Decides: "Which pairs are safe to trade today?".</w:t>
       </w:r>
     </w:p>
     <w:p>
@@ -1162,6 +1140,35 @@
       </w:r>
     </w:p>
     <w:p>
+      <w:pPr>
+        <w:numPr>
+          <w:ilvl w:val="0"/>
+          <w:numId w:val="106"/>
+        </w:numPr>
+      </w:pPr>
+      <w:r>
+        <w:t>Note: is this a better to have a csv that will be updated daily? This will contain the pairs that qualify?</w:t>
+      </w:r>
+      <w:r>
+        <w:t xml:space="preserve"> That way, it will not scan the entire symbols.mqh</w:t>
+      </w:r>
+      <w:r>
+        <w:t xml:space="preserve"> repeatedly</w:t>
+      </w:r>
+      <w:r>
+        <w:t>?</w:t>
+      </w:r>
+      <w:r>
+        <w:t xml:space="preserve"> Or there are times that mid day it will qualify? What do you think?</w:t>
+      </w:r>
+      <w:r>
+        <w:t xml:space="preserve"> I believe you can create a better implementation here</w:t>
+      </w:r>
+      <w:r>
+        <w:t xml:space="preserve"> to minimize the multiple times it checks the daily tf?</w:t>
+      </w:r>
+    </w:p>
+    <w:p>
       <w:r>
         <w:rPr>
           <w:b/>
@@ -1199,13 +1206,8 @@
           <w:numId w:val="107"/>
         </w:numPr>
       </w:pPr>
-      <w:proofErr w:type="gramStart"/>
-      <w:r>
-        <w:t>Looks</w:t>
-      </w:r>
-      <w:proofErr w:type="gramEnd"/>
-      <w:r>
-        <w:t xml:space="preserve"> only at the approved pairs.</w:t>
+      <w:r>
+        <w:t>Looks only at the approved pairs.</w:t>
       </w:r>
     </w:p>
     <w:p>
@@ -1398,6 +1400,7 @@
           <w:b/>
           <w:bCs/>
         </w:rPr>
+        <w:lastRenderedPageBreak/>
         <w:t>Mean reversion:</w:t>
       </w:r>
       <w:r>
@@ -1406,15 +1409,7 @@
     </w:p>
     <w:p>
       <w:r>
-        <w:t xml:space="preserve">We're trying to catch that </w:t>
-      </w:r>
-      <w:proofErr w:type="gramStart"/>
-      <w:r>
-        <w:t>"snap back" moment</w:t>
-      </w:r>
-      <w:proofErr w:type="gramEnd"/>
-      <w:r>
-        <w:t>.</w:t>
+        <w:t>We're trying to catch that "snap back" moment.</w:t>
       </w:r>
     </w:p>
     <w:p>
@@ -1434,8 +1429,189 @@
     </w:p>
     <w:p>
       <w:r>
+        <w:t>text</w:t>
+      </w:r>
+    </w:p>
+    <w:p>
+      <w:r>
+        <w:t>┌─────────────────────────────────────────────────────────────┐</w:t>
+      </w:r>
+    </w:p>
+    <w:p>
+      <w:r>
+        <w:t>│ DAILY (00:05 GMT)                                           │</w:t>
+      </w:r>
+    </w:p>
+    <w:p>
+      <w:r>
+        <w:t>│ Check All 14 Pairs on D1 Chart                              │</w:t>
+      </w:r>
+    </w:p>
+    <w:p>
+      <w:r>
+        <w:t>│                                                             │</w:t>
+      </w:r>
+    </w:p>
+    <w:p>
+      <w:r>
+        <w:t>│ For Each Pair:                                              │</w:t>
+      </w:r>
+    </w:p>
+    <w:p>
+      <w:r>
+        <w:t>│ ✓ Is price above D1 50 EMA? (uptrend)                       │</w:t>
+      </w:r>
+    </w:p>
+    <w:p>
+      <w:r>
+        <w:t>│ ✓ Is D1 ADX &lt; 25? (not too trending)                        │</w:t>
+      </w:r>
+    </w:p>
+    <w:p>
+      <w:r>
+        <w:t>│ ✓ Is D1 ATR adequate? (enough volatility)                   │</w:t>
+      </w:r>
+    </w:p>
+    <w:p>
+      <w:r>
+        <w:t>│                                                             │</w:t>
+      </w:r>
+    </w:p>
+    <w:p>
+      <w:r>
+        <w:t>│ IF YES to all → Add to "Approved Pairs List"                │</w:t>
+      </w:r>
+    </w:p>
+    <w:p>
+      <w:r>
+        <w:t>│ IF NO to any → Skip this pair for today                     │</w:t>
+      </w:r>
+    </w:p>
+    <w:p>
+      <w:r>
+        <w:t>└────────────────</w:t>
+      </w:r>
+      <w:r>
+        <w:rPr>
+          <w:rFonts w:ascii="MS Gothic" w:eastAsia="MS Gothic" w:hAnsi="MS Gothic" w:cs="MS Gothic" w:hint="eastAsia"/>
+        </w:rPr>
+        <w:t>┬</w:t>
+      </w:r>
+      <w:r>
+        <w:rPr>
+          <w:rFonts w:ascii="Aptos" w:hAnsi="Aptos" w:cs="Aptos"/>
+        </w:rPr>
+        <w:t>────────────────────────────────────────────┘</w:t>
+      </w:r>
+    </w:p>
+    <w:p>
+      <w:r>
+        <w:t xml:space="preserve">                 │</w:t>
+      </w:r>
+    </w:p>
+    <w:p>
+      <w:r>
+        <w:t xml:space="preserve">                 </w:t>
+      </w:r>
+      <w:r>
+        <w:rPr>
+          <w:rFonts w:ascii="Arial" w:hAnsi="Arial" w:cs="Arial"/>
+        </w:rPr>
+        <w:t>▼</w:t>
+      </w:r>
+    </w:p>
+    <w:p>
+      <w:r>
+        <w:t>┌─────────────────────────────────────────────────────────────┐</w:t>
+      </w:r>
+    </w:p>
+    <w:p>
+      <w:r>
+        <w:t>│ EVERY 4 HOURS (00:00, 04:00, 08:00...)                     │</w:t>
+      </w:r>
+    </w:p>
+    <w:p>
+      <w:r>
+        <w:t>│ Check Approved Pairs on H4 Chart                            │</w:t>
+      </w:r>
+    </w:p>
+    <w:p>
+      <w:r>
+        <w:t>│                                                             │</w:t>
+      </w:r>
+    </w:p>
+    <w:p>
+      <w:r>
+        <w:t>│ For Each Approved Pair:                                     │</w:t>
+      </w:r>
+    </w:p>
+    <w:p>
+      <w:r>
+        <w:t>│ ✓ Is H4 price below Lower Bollinger Band?                   │</w:t>
+      </w:r>
+    </w:p>
+    <w:p>
+      <w:r>
+        <w:t>│ ✓ Is H4 RSI &lt; 30? (oversold)                                │</w:t>
+      </w:r>
+    </w:p>
+    <w:p>
+      <w:r>
         <w:lastRenderedPageBreak/>
-        <w:t>text</w:t>
+        <w:t>│ ✓ Is there a bullish reversal candle on H4?                 │</w:t>
+      </w:r>
+    </w:p>
+    <w:p>
+      <w:r>
+        <w:t>│ ✓ Do we already have a position on this pair?               │</w:t>
+      </w:r>
+    </w:p>
+    <w:p>
+      <w:r>
+        <w:t>│                                                             │</w:t>
+      </w:r>
+    </w:p>
+    <w:p>
+      <w:r>
+        <w:t>│ IF YES to first 3 AND NO to last → ENTER TRADE              │</w:t>
+      </w:r>
+    </w:p>
+    <w:p>
+      <w:r>
+        <w:t>│ IF ANY condition fails → Wait for next 4H candle            │</w:t>
+      </w:r>
+    </w:p>
+    <w:p>
+      <w:r>
+        <w:t>└────────────────</w:t>
+      </w:r>
+      <w:r>
+        <w:rPr>
+          <w:rFonts w:ascii="MS Gothic" w:eastAsia="MS Gothic" w:hAnsi="MS Gothic" w:cs="MS Gothic" w:hint="eastAsia"/>
+        </w:rPr>
+        <w:t>┬</w:t>
+      </w:r>
+      <w:r>
+        <w:rPr>
+          <w:rFonts w:ascii="Aptos" w:hAnsi="Aptos" w:cs="Aptos"/>
+        </w:rPr>
+        <w:t>────────────────────────────────────────────┘</w:t>
+      </w:r>
+    </w:p>
+    <w:p>
+      <w:r>
+        <w:t xml:space="preserve">                 │</w:t>
+      </w:r>
+    </w:p>
+    <w:p>
+      <w:r>
+        <w:t xml:space="preserve">                 </w:t>
+      </w:r>
+      <w:r>
+        <w:rPr>
+          <w:rFonts w:ascii="Arial" w:hAnsi="Arial" w:cs="Arial"/>
+        </w:rPr>
+        <w:t>▼</w:t>
       </w:r>
     </w:p>
     <w:p>
@@ -1445,20 +1621,12 @@
     </w:p>
     <w:p>
       <w:r>
-        <w:t xml:space="preserve">│ DAILY (00:05 </w:t>
-      </w:r>
-      <w:proofErr w:type="gramStart"/>
-      <w:r>
-        <w:t xml:space="preserve">GMT)   </w:t>
-      </w:r>
-      <w:proofErr w:type="gramEnd"/>
-      <w:r>
-        <w:t xml:space="preserve">                                        │</w:t>
-      </w:r>
-    </w:p>
-    <w:p>
-      <w:r>
-        <w:t>│ Check All 14 Pairs on D1 Chart                              │</w:t>
+        <w:t>│ POSITION MANAGEMENT                                         │</w:t>
+      </w:r>
+    </w:p>
+    <w:p>
+      <w:r>
+        <w:t>│ (Checked every 4 hours while trade is open)                 │</w:t>
       </w:r>
     </w:p>
     <w:p>
@@ -1468,46 +1636,27 @@
     </w:p>
     <w:p>
       <w:r>
-        <w:t>│ For Each Pair:                                              │</w:t>
-      </w:r>
-    </w:p>
-    <w:p>
-      <w:r>
-        <w:t>│ ✓ Is price above D1 50 EMA? (</w:t>
-      </w:r>
-      <w:proofErr w:type="gramStart"/>
-      <w:r>
-        <w:t xml:space="preserve">uptrend)   </w:t>
-      </w:r>
-      <w:proofErr w:type="gramEnd"/>
-      <w:r>
-        <w:t xml:space="preserve">                    │</w:t>
-      </w:r>
-    </w:p>
-    <w:p>
-      <w:r>
-        <w:t xml:space="preserve">│ ✓ Is D1 ADX &lt; 25? (not too </w:t>
-      </w:r>
-      <w:proofErr w:type="gramStart"/>
-      <w:r>
-        <w:t xml:space="preserve">trending)   </w:t>
-      </w:r>
-      <w:proofErr w:type="gramEnd"/>
-      <w:r>
-        <w:t xml:space="preserve">                     │</w:t>
-      </w:r>
-    </w:p>
-    <w:p>
-      <w:r>
-        <w:t xml:space="preserve">│ ✓ Is D1 ATR adequate? (enough </w:t>
-      </w:r>
-      <w:proofErr w:type="gramStart"/>
-      <w:r>
-        <w:t xml:space="preserve">volatility)   </w:t>
-      </w:r>
-      <w:proofErr w:type="gramEnd"/>
-      <w:r>
-        <w:t xml:space="preserve">                │</w:t>
+        <w:t>│ Exit if ANY of these occur:                                 │</w:t>
+      </w:r>
+    </w:p>
+    <w:p>
+      <w:r>
+        <w:t>│ • Stop Loss is hit (2 × ATR below entry)                    │</w:t>
+      </w:r>
+    </w:p>
+    <w:p>
+      <w:r>
+        <w:t>│ • Take Profit is hit (1.5 × risk above entry)               │</w:t>
+      </w:r>
+    </w:p>
+    <w:p>
+      <w:r>
+        <w:t>│ • Price crosses above H4 Middle Bollinger Band              │</w:t>
+      </w:r>
+    </w:p>
+    <w:p>
+      <w:r>
+        <w:t>│ • Trade has been open for 20 days                           │</w:t>
       </w:r>
     </w:p>
     <w:p>
@@ -1517,225 +1666,6 @@
     </w:p>
     <w:p>
       <w:r>
-        <w:t>│ IF YES to all → Add to "Approved Pairs List"                │</w:t>
-      </w:r>
-    </w:p>
-    <w:p>
-      <w:r>
-        <w:t>│ IF NO to any → Skip this pair for today                     │</w:t>
-      </w:r>
-    </w:p>
-    <w:p>
-      <w:r>
-        <w:t>└────────────────</w:t>
-      </w:r>
-      <w:r>
-        <w:rPr>
-          <w:rFonts w:ascii="MS Gothic" w:eastAsia="MS Gothic" w:hAnsi="MS Gothic" w:cs="MS Gothic" w:hint="eastAsia"/>
-        </w:rPr>
-        <w:t>┬</w:t>
-      </w:r>
-      <w:r>
-        <w:rPr>
-          <w:rFonts w:ascii="Aptos" w:hAnsi="Aptos" w:cs="Aptos"/>
-        </w:rPr>
-        <w:t>────────────────────────────────────────────┘</w:t>
-      </w:r>
-    </w:p>
-    <w:p>
-      <w:r>
-        <w:t xml:space="preserve">                 │</w:t>
-      </w:r>
-    </w:p>
-    <w:p>
-      <w:r>
-        <w:t xml:space="preserve">                 </w:t>
-      </w:r>
-      <w:r>
-        <w:rPr>
-          <w:rFonts w:ascii="Arial" w:hAnsi="Arial" w:cs="Arial"/>
-        </w:rPr>
-        <w:t>▼</w:t>
-      </w:r>
-    </w:p>
-    <w:p>
-      <w:r>
-        <w:t>┌─────────────────────────────────────────────────────────────┐</w:t>
-      </w:r>
-    </w:p>
-    <w:p>
-      <w:r>
-        <w:t>│ EVERY 4 HOURS (00:00, 04:00, 08:00...)                     │</w:t>
-      </w:r>
-    </w:p>
-    <w:p>
-      <w:r>
-        <w:t>│ Check Approved Pairs on H4 Chart                            │</w:t>
-      </w:r>
-    </w:p>
-    <w:p>
-      <w:r>
-        <w:t>│                                                             │</w:t>
-      </w:r>
-    </w:p>
-    <w:p>
-      <w:r>
-        <w:t>│ For Each Approved Pair:                                     │</w:t>
-      </w:r>
-    </w:p>
-    <w:p>
-      <w:r>
-        <w:t>│ ✓ Is H4 price below Lower Bollinger Band?                   │</w:t>
-      </w:r>
-    </w:p>
-    <w:p>
-      <w:r>
-        <w:t>│ ✓ Is H4 RSI &lt; 30? (</w:t>
-      </w:r>
-      <w:proofErr w:type="gramStart"/>
-      <w:r>
-        <w:t xml:space="preserve">oversold)   </w:t>
-      </w:r>
-      <w:proofErr w:type="gramEnd"/>
-      <w:r>
-        <w:t xml:space="preserve">                             │</w:t>
-      </w:r>
-    </w:p>
-    <w:p>
-      <w:r>
-        <w:t>│ ✓ Is there a bullish reversal candle on H4?                 │</w:t>
-      </w:r>
-    </w:p>
-    <w:p>
-      <w:r>
-        <w:t>│ ✓ Do we already have a position on this pair?               │</w:t>
-      </w:r>
-    </w:p>
-    <w:p>
-      <w:r>
-        <w:t>│                                                             │</w:t>
-      </w:r>
-    </w:p>
-    <w:p>
-      <w:r>
-        <w:t>│ IF YES to first 3 AND NO to last → ENTER TRADE              │</w:t>
-      </w:r>
-    </w:p>
-    <w:p>
-      <w:r>
-        <w:lastRenderedPageBreak/>
-        <w:t>│ IF ANY condition fails → Wait for next 4H candle            │</w:t>
-      </w:r>
-    </w:p>
-    <w:p>
-      <w:r>
-        <w:t>└────────────────</w:t>
-      </w:r>
-      <w:r>
-        <w:rPr>
-          <w:rFonts w:ascii="MS Gothic" w:eastAsia="MS Gothic" w:hAnsi="MS Gothic" w:cs="MS Gothic" w:hint="eastAsia"/>
-        </w:rPr>
-        <w:t>┬</w:t>
-      </w:r>
-      <w:r>
-        <w:rPr>
-          <w:rFonts w:ascii="Aptos" w:hAnsi="Aptos" w:cs="Aptos"/>
-        </w:rPr>
-        <w:t>────────────────────────────────────────────┘</w:t>
-      </w:r>
-    </w:p>
-    <w:p>
-      <w:r>
-        <w:t xml:space="preserve">                 │</w:t>
-      </w:r>
-    </w:p>
-    <w:p>
-      <w:r>
-        <w:t xml:space="preserve">                 </w:t>
-      </w:r>
-      <w:r>
-        <w:rPr>
-          <w:rFonts w:ascii="Arial" w:hAnsi="Arial" w:cs="Arial"/>
-        </w:rPr>
-        <w:t>▼</w:t>
-      </w:r>
-    </w:p>
-    <w:p>
-      <w:r>
-        <w:t>┌─────────────────────────────────────────────────────────────┐</w:t>
-      </w:r>
-    </w:p>
-    <w:p>
-      <w:r>
-        <w:t>│ POSITION MANAGEMENT                                         │</w:t>
-      </w:r>
-    </w:p>
-    <w:p>
-      <w:r>
-        <w:t xml:space="preserve">│ (Checked every 4 hours while trade is </w:t>
-      </w:r>
-      <w:proofErr w:type="gramStart"/>
-      <w:r>
-        <w:t xml:space="preserve">open)   </w:t>
-      </w:r>
-      <w:proofErr w:type="gramEnd"/>
-      <w:r>
-        <w:t xml:space="preserve">              │</w:t>
-      </w:r>
-    </w:p>
-    <w:p>
-      <w:r>
-        <w:t>│                                                             │</w:t>
-      </w:r>
-    </w:p>
-    <w:p>
-      <w:r>
-        <w:t>│ Exit if ANY of these occur:                                 │</w:t>
-      </w:r>
-    </w:p>
-    <w:p>
-      <w:r>
-        <w:t xml:space="preserve">│ • Stop Loss is hit (2 × ATR below </w:t>
-      </w:r>
-      <w:proofErr w:type="gramStart"/>
-      <w:r>
-        <w:t xml:space="preserve">entry)   </w:t>
-      </w:r>
-      <w:proofErr w:type="gramEnd"/>
-      <w:r>
-        <w:t xml:space="preserve">                 │</w:t>
-      </w:r>
-    </w:p>
-    <w:p>
-      <w:r>
-        <w:t xml:space="preserve">│ • Take Profit is hit (1.5 × risk above </w:t>
-      </w:r>
-      <w:proofErr w:type="gramStart"/>
-      <w:r>
-        <w:t xml:space="preserve">entry)   </w:t>
-      </w:r>
-      <w:proofErr w:type="gramEnd"/>
-      <w:r>
-        <w:t xml:space="preserve">            │</w:t>
-      </w:r>
-    </w:p>
-    <w:p>
-      <w:r>
-        <w:t>│ • Price crosses above H4 Middle Bollinger Band              │</w:t>
-      </w:r>
-    </w:p>
-    <w:p>
-      <w:r>
-        <w:t>│ • Trade has been open for 20 days                           │</w:t>
-      </w:r>
-    </w:p>
-    <w:p>
-      <w:r>
-        <w:t>│                                                             │</w:t>
-      </w:r>
-    </w:p>
-    <w:p>
-      <w:r>
         <w:t>│ Move stop to breakeven if:                                  │</w:t>
       </w:r>
     </w:p>
@@ -1752,7 +1682,7 @@
     <w:p>
       <w:r>
         <w:pict w14:anchorId="69566A40">
-          <v:rect id="_x0000_i1235" style="width:0;height:.75pt" o:hralign="center" o:hrstd="t" o:hr="t" fillcolor="#a0a0a0" stroked="f"/>
+          <v:rect id="_x0000_i1029" style="width:0;height:.75pt" o:hralign="center" o:hrstd="t" o:hr="t" fillcolor="#a0a0a0" stroked="f"/>
         </w:pict>
       </w:r>
     </w:p>
@@ -1851,6 +1781,7 @@
                 <w:b/>
                 <w:bCs/>
               </w:rPr>
+              <w:lastRenderedPageBreak/>
               <w:t>Pair</w:t>
             </w:r>
           </w:p>
@@ -1977,7 +1908,6 @@
           </w:tcPr>
           <w:p>
             <w:r>
-              <w:lastRenderedPageBreak/>
               <w:t>GBPUSD</w:t>
             </w:r>
           </w:p>
@@ -2756,6 +2686,7 @@
           </w:tcPr>
           <w:p>
             <w:r>
+              <w:lastRenderedPageBreak/>
               <w:t>NZDJPY</w:t>
             </w:r>
           </w:p>
@@ -2819,7 +2750,6 @@
           <w:b/>
           <w:bCs/>
         </w:rPr>
-        <w:lastRenderedPageBreak/>
         <w:t>Selection Criteria:</w:t>
       </w:r>
     </w:p>
@@ -2874,15 +2804,7 @@
         <w:t>Behavior:</w:t>
       </w:r>
       <w:r>
-        <w:t xml:space="preserve"> All </w:t>
-      </w:r>
-      <w:proofErr w:type="gramStart"/>
-      <w:r>
-        <w:t>exhibit</w:t>
-      </w:r>
-      <w:proofErr w:type="gramEnd"/>
-      <w:r>
-        <w:t xml:space="preserve"> mean reversion characteristics.</w:t>
+        <w:t> All exhibit mean reversion characteristics.</w:t>
       </w:r>
     </w:p>
     <w:p>
@@ -2900,15 +2822,7 @@
         <w:t>Data Quality:</w:t>
       </w:r>
       <w:r>
-        <w:t xml:space="preserve"> All have reliable historical data for </w:t>
-      </w:r>
-      <w:proofErr w:type="spellStart"/>
-      <w:r>
-        <w:t>backtesting</w:t>
-      </w:r>
-      <w:proofErr w:type="spellEnd"/>
-      <w:r>
-        <w:t>.</w:t>
+        <w:t> All have reliable historical data for backtesting.</w:t>
       </w:r>
     </w:p>
     <w:p>
@@ -2961,15 +2875,7 @@
         </w:numPr>
       </w:pPr>
       <w:r>
-        <w:t xml:space="preserve">Exotic pairs (e.g., USDTRY, USDZAR) - too volatile, </w:t>
-      </w:r>
-      <w:proofErr w:type="gramStart"/>
-      <w:r>
-        <w:t>wide spreads</w:t>
-      </w:r>
-      <w:proofErr w:type="gramEnd"/>
-      <w:r>
-        <w:t>.</w:t>
+        <w:t>Exotic pairs (e.g., USDTRY, USDZAR) - too volatile, wide spreads.</w:t>
       </w:r>
     </w:p>
     <w:p>
@@ -3045,15 +2951,7 @@
     </w:p>
     <w:p>
       <w:r>
-        <w:t xml:space="preserve">All pairs must </w:t>
-      </w:r>
-      <w:proofErr w:type="gramStart"/>
-      <w:r>
-        <w:t>meet these criteria at all times</w:t>
-      </w:r>
-      <w:proofErr w:type="gramEnd"/>
-      <w:r>
-        <w:t>:</w:t>
+        <w:t>All pairs must meet these criteria at all times:</w:t>
       </w:r>
     </w:p>
     <w:tbl>
@@ -3189,15 +3087,7 @@
           </w:tcPr>
           <w:p>
             <w:r>
-              <w:t xml:space="preserve">3 </w:t>
-            </w:r>
-            <w:proofErr w:type="gramStart"/>
-            <w:r>
-              <w:t>pips</w:t>
-            </w:r>
-            <w:proofErr w:type="gramEnd"/>
-            <w:r>
-              <w:t xml:space="preserve"> or less</w:t>
+              <w:t>3 pips or less</w:t>
             </w:r>
           </w:p>
         </w:tc>
@@ -3299,6 +3189,7 @@
                 <w:b/>
                 <w:bCs/>
               </w:rPr>
+              <w:lastRenderedPageBreak/>
               <w:t>Broker Availability</w:t>
             </w:r>
           </w:p>
@@ -3415,9 +3306,8 @@
     </w:p>
     <w:p>
       <w:r>
-        <w:lastRenderedPageBreak/>
         <w:pict w14:anchorId="333717E1">
-          <v:rect id="_x0000_i1236" style="width:0;height:.75pt" o:hralign="center" o:hrstd="t" o:hr="t" fillcolor="#a0a0a0" stroked="f"/>
+          <v:rect id="_x0000_i1030" style="width:0;height:.75pt" o:hralign="center" o:hrstd="t" o:hr="t" fillcolor="#a0a0a0" stroked="f"/>
         </w:pict>
       </w:r>
     </w:p>
@@ -3723,13 +3613,8 @@
             <w:hideMark/>
           </w:tcPr>
           <w:p>
-            <w:proofErr w:type="gramStart"/>
             <w:r>
-              <w:t>Finds</w:t>
-            </w:r>
-            <w:proofErr w:type="gramEnd"/>
-            <w:r>
-              <w:t xml:space="preserve"> precise entry opportunities</w:t>
+              <w:t>Finds precise entry opportunities</w:t>
             </w:r>
           </w:p>
         </w:tc>
@@ -3898,6 +3783,7 @@
         </w:numPr>
       </w:pPr>
       <w:r>
+        <w:lastRenderedPageBreak/>
         <w:t>More responsive than daily.</w:t>
       </w:r>
     </w:p>
@@ -3973,7 +3859,6 @@
         </w:numPr>
       </w:pPr>
       <w:r>
-        <w:lastRenderedPageBreak/>
         <w:t>Not used for entries or initial exits.</w:t>
       </w:r>
     </w:p>
@@ -4040,15 +3925,7 @@
     </w:p>
     <w:p>
       <w:r>
-        <w:t xml:space="preserve">│ Checks: Trend direction, market </w:t>
-      </w:r>
-      <w:proofErr w:type="gramStart"/>
-      <w:r>
-        <w:t xml:space="preserve">regime,   </w:t>
-      </w:r>
-      <w:proofErr w:type="gramEnd"/>
-      <w:r>
-        <w:t xml:space="preserve">       │</w:t>
+        <w:t>│ Checks: Trend direction, market regime,          │</w:t>
       </w:r>
     </w:p>
     <w:p>
@@ -4117,6 +3994,7 @@
     </w:p>
     <w:p>
       <w:r>
+        <w:lastRenderedPageBreak/>
         <w:t>│ 4-HOUR (H4) - THE TRIGGER                        │</w:t>
       </w:r>
     </w:p>
@@ -4142,15 +4020,7 @@
     </w:p>
     <w:p>
       <w:r>
-        <w:t xml:space="preserve">│ Checks: Price extreme, momentum </w:t>
-      </w:r>
-      <w:proofErr w:type="gramStart"/>
-      <w:r>
-        <w:t xml:space="preserve">exhaustion,   </w:t>
-      </w:r>
-      <w:proofErr w:type="gramEnd"/>
-      <w:r>
-        <w:t xml:space="preserve">   │</w:t>
+        <w:t>│ Checks: Price extreme, momentum exhaustion,      │</w:t>
       </w:r>
     </w:p>
     <w:p>
@@ -4160,7 +4030,6 @@
     </w:p>
     <w:p>
       <w:r>
-        <w:lastRenderedPageBreak/>
         <w:t>│                                                  │</w:t>
       </w:r>
     </w:p>
@@ -4300,6 +4169,7 @@
         </w:numPr>
       </w:pPr>
       <w:r>
+        <w:lastRenderedPageBreak/>
         <w:t>00:00 (midnight)</w:t>
       </w:r>
     </w:p>
@@ -4371,7 +4241,6 @@
         </w:numPr>
       </w:pPr>
       <w:r>
-        <w:lastRenderedPageBreak/>
         <w:t>00:00 GMT (midnight) every day</w:t>
       </w:r>
     </w:p>
@@ -4384,15 +4253,7 @@
         <w:t>Important:</w:t>
       </w:r>
       <w:r>
-        <w:t xml:space="preserve"> The system makes decisions at candle CLOSE, not during </w:t>
-      </w:r>
-      <w:proofErr w:type="gramStart"/>
-      <w:r>
-        <w:t>the candle</w:t>
-      </w:r>
-      <w:proofErr w:type="gramEnd"/>
-      <w:r>
-        <w:t xml:space="preserve"> formation.</w:t>
+        <w:t> The system makes decisions at candle CLOSE, not during the candle formation.</w:t>
       </w:r>
     </w:p>
     <w:p>
@@ -4440,7 +4301,7 @@
     <w:p>
       <w:r>
         <w:pict w14:anchorId="639BEB87">
-          <v:rect id="_x0000_i1237" style="width:0;height:.75pt" o:hralign="center" o:hrstd="t" o:hr="t" fillcolor="#a0a0a0" stroked="f"/>
+          <v:rect id="_x0000_i1031" style="width:0;height:.75pt" o:hralign="center" o:hrstd="t" o:hr="t" fillcolor="#a0a0a0" stroked="f"/>
         </w:pict>
       </w:r>
     </w:p>
@@ -4483,15 +4344,7 @@
         <w:t>Problem:</w:t>
       </w:r>
       <w:r>
-        <w:t xml:space="preserve"> If we just </w:t>
-      </w:r>
-      <w:proofErr w:type="gramStart"/>
-      <w:r>
-        <w:t>look</w:t>
-      </w:r>
-      <w:proofErr w:type="gramEnd"/>
-      <w:r>
-        <w:t xml:space="preserve"> at 4-hour charts alone, we'd take trades in:</w:t>
+        <w:t> If we just look at 4-hour charts alone, we'd take trades in:</w:t>
       </w:r>
     </w:p>
     <w:p>
@@ -4615,6 +4468,7 @@
           <w:b/>
           <w:bCs/>
         </w:rPr>
+        <w:lastRenderedPageBreak/>
         <w:t>Criteria:</w:t>
       </w:r>
       <w:r>
@@ -4694,7 +4548,6 @@
           <w:b/>
           <w:bCs/>
         </w:rPr>
-        <w:lastRenderedPageBreak/>
         <w:t>Decision:</w:t>
       </w:r>
       <w:r>
@@ -4807,15 +4660,7 @@
         <w:t>Rule 2:</w:t>
       </w:r>
       <w:r>
-        <w:t xml:space="preserve"> D1 approval </w:t>
-      </w:r>
-      <w:proofErr w:type="gramStart"/>
-      <w:r>
-        <w:t>lasts for</w:t>
-      </w:r>
-      <w:proofErr w:type="gramEnd"/>
-      <w:r>
-        <w:t xml:space="preserve"> 24 hours.</w:t>
+        <w:t> D1 approval lasts for 24 hours.</w:t>
       </w:r>
     </w:p>
     <w:p>
@@ -4942,6 +4787,7 @@
           <w:b/>
           <w:bCs/>
         </w:rPr>
+        <w:lastRenderedPageBreak/>
         <w:t>5.4 Example of Filters Working Together</w:t>
       </w:r>
     </w:p>
@@ -5046,7 +4892,6 @@
         </w:numPr>
       </w:pPr>
       <w:r>
-        <w:lastRenderedPageBreak/>
         <w:t>...continues for all 14 pairs...</w:t>
       </w:r>
     </w:p>
@@ -5278,7 +5123,7 @@
     <w:p>
       <w:r>
         <w:pict w14:anchorId="6FA77D3F">
-          <v:rect id="_x0000_i1238" style="width:0;height:.75pt" o:hralign="center" o:hrstd="t" o:hr="t" fillcolor="#a0a0a0" stroked="f"/>
+          <v:rect id="_x0000_i1032" style="width:0;height:.75pt" o:hralign="center" o:hrstd="t" o:hr="t" fillcolor="#a0a0a0" stroked="f"/>
         </w:pict>
       </w:r>
     </w:p>
@@ -5318,18 +5163,11 @@
           <w:b/>
           <w:bCs/>
         </w:rPr>
+        <w:lastRenderedPageBreak/>
         <w:t>Goal:</w:t>
       </w:r>
       <w:r>
-        <w:t xml:space="preserve"> Identify pairs where </w:t>
-      </w:r>
-      <w:proofErr w:type="gramStart"/>
-      <w:r>
-        <w:t>mean reversion</w:t>
-      </w:r>
-      <w:proofErr w:type="gramEnd"/>
-      <w:r>
-        <w:t xml:space="preserve"> is likely to work well over the next 24 hours.</w:t>
+        <w:t> Identify pairs where mean reversion is likely to work well over the next 24 hours.</w:t>
       </w:r>
     </w:p>
     <w:p>
@@ -5406,7 +5244,6 @@
           <w:b/>
           <w:bCs/>
         </w:rPr>
-        <w:lastRenderedPageBreak/>
         <w:t>Timing:</w:t>
       </w:r>
       <w:r>
@@ -5441,15 +5278,7 @@
         </w:numPr>
       </w:pPr>
       <w:r>
-        <w:t xml:space="preserve">We </w:t>
-      </w:r>
-      <w:proofErr w:type="gramStart"/>
-      <w:r>
-        <w:t>wait</w:t>
-      </w:r>
-      <w:proofErr w:type="gramEnd"/>
-      <w:r>
-        <w:t xml:space="preserve"> 5 minutes for broker data to stabilize.</w:t>
+        <w:t>We wait 5 minutes for broker data to stabilize.</w:t>
       </w:r>
     </w:p>
     <w:p>
@@ -5501,13 +5330,8 @@
           <w:numId w:val="131"/>
         </w:numPr>
       </w:pPr>
-      <w:proofErr w:type="gramStart"/>
-      <w:r>
-        <w:t>Checks</w:t>
-      </w:r>
-      <w:proofErr w:type="gramEnd"/>
-      <w:r>
-        <w:t xml:space="preserve"> each pair against the three filters below.</w:t>
+      <w:r>
+        <w:t>Checks each pair against the three filters below.</w:t>
       </w:r>
     </w:p>
     <w:p>
@@ -5588,39 +5412,7 @@
           <w:b/>
           <w:bCs/>
         </w:rPr>
-        <w:t xml:space="preserve">What </w:t>
-      </w:r>
-      <w:proofErr w:type="gramStart"/>
-      <w:r>
-        <w:rPr>
-          <w:b/>
-          <w:bCs/>
-        </w:rPr>
-        <w:t>this</w:t>
-      </w:r>
-      <w:proofErr w:type="gramEnd"/>
-      <w:r>
-        <w:rPr>
-          <w:b/>
-          <w:bCs/>
-        </w:rPr>
-        <w:t xml:space="preserve"> </w:t>
-      </w:r>
-      <w:proofErr w:type="gramStart"/>
-      <w:r>
-        <w:rPr>
-          <w:b/>
-          <w:bCs/>
-        </w:rPr>
-        <w:t>means</w:t>
-      </w:r>
-      <w:proofErr w:type="gramEnd"/>
-      <w:r>
-        <w:rPr>
-          <w:b/>
-          <w:bCs/>
-        </w:rPr>
-        <w:t>:</w:t>
+        <w:t>What this means:</w:t>
       </w:r>
     </w:p>
     <w:p>
@@ -5672,13 +5464,9 @@
           <w:numId w:val="133"/>
         </w:numPr>
       </w:pPr>
-      <w:proofErr w:type="gramStart"/>
-      <w:r>
-        <w:t>EMA(</w:t>
-      </w:r>
-      <w:proofErr w:type="gramEnd"/>
-      <w:r>
-        <w:t>50) on Daily chart.</w:t>
+      <w:r>
+        <w:lastRenderedPageBreak/>
+        <w:t>EMA(50) on Daily chart.</w:t>
       </w:r>
     </w:p>
     <w:p>
@@ -5720,15 +5508,7 @@
         </w:numPr>
       </w:pPr>
       <w:r>
-        <w:t>IF </w:t>
-      </w:r>
-      <w:proofErr w:type="spellStart"/>
-      <w:r>
-        <w:t>Current_Close_Price</w:t>
-      </w:r>
-      <w:proofErr w:type="spellEnd"/>
-      <w:r>
-        <w:t xml:space="preserve"> &gt; D1_EMA_50: </w:t>
+        <w:t>IF Current_Close_Price &gt; D1_EMA_50: </w:t>
       </w:r>
       <w:r>
         <w:rPr>
@@ -5780,7 +5560,6 @@
           <w:b/>
           <w:bCs/>
         </w:rPr>
-        <w:lastRenderedPageBreak/>
         <w:t>Indicator:</w:t>
       </w:r>
       <w:r>
@@ -5953,13 +5732,8 @@
           <w:numId w:val="137"/>
         </w:numPr>
       </w:pPr>
-      <w:proofErr w:type="gramStart"/>
-      <w:r>
-        <w:t>ADX(</w:t>
-      </w:r>
-      <w:proofErr w:type="gramEnd"/>
-      <w:r>
-        <w:t>14) on Daily chart.</w:t>
+      <w:r>
+        <w:t>ADX(14) on Daily chart.</w:t>
       </w:r>
     </w:p>
     <w:p>
@@ -6019,6 +5793,7 @@
         </w:numPr>
       </w:pPr>
       <w:r>
+        <w:lastRenderedPageBreak/>
         <w:t>ELSE: </w:t>
       </w:r>
       <w:r>
@@ -6120,7 +5895,6 @@
           <w:b/>
           <w:bCs/>
         </w:rPr>
-        <w:lastRenderedPageBreak/>
         <w:t>Why we need this check:</w:t>
       </w:r>
     </w:p>
@@ -6154,15 +5928,7 @@
         </w:numPr>
       </w:pPr>
       <w:r>
-        <w:t xml:space="preserve">Dead markets don't </w:t>
-      </w:r>
-      <w:proofErr w:type="gramStart"/>
-      <w:r>
-        <w:t>revert,</w:t>
-      </w:r>
-      <w:proofErr w:type="gramEnd"/>
-      <w:r>
-        <w:t xml:space="preserve"> they just sit there.</w:t>
+        <w:t>Dead markets don't revert, they just sit there.</w:t>
       </w:r>
     </w:p>
     <w:p>
@@ -6181,21 +5947,8 @@
           <w:numId w:val="141"/>
         </w:numPr>
       </w:pPr>
-      <w:proofErr w:type="spellStart"/>
-      <w:r>
-        <w:t>ATR_Current</w:t>
-      </w:r>
-      <w:proofErr w:type="spellEnd"/>
-      <w:r>
-        <w:t xml:space="preserve"> = </w:t>
-      </w:r>
-      <w:proofErr w:type="gramStart"/>
-      <w:r>
-        <w:t>ATR(</w:t>
-      </w:r>
-      <w:proofErr w:type="gramEnd"/>
-      <w:r>
-        <w:t>14) on D1, current value.</w:t>
+      <w:r>
+        <w:t>ATR_Current = ATR(14) on D1, current value.</w:t>
       </w:r>
     </w:p>
     <w:p>
@@ -6205,21 +5958,8 @@
           <w:numId w:val="141"/>
         </w:numPr>
       </w:pPr>
-      <w:proofErr w:type="spellStart"/>
-      <w:r>
-        <w:t>ATR_Average</w:t>
-      </w:r>
-      <w:proofErr w:type="spellEnd"/>
-      <w:r>
-        <w:t xml:space="preserve"> = Average of last 50 </w:t>
-      </w:r>
-      <w:proofErr w:type="gramStart"/>
-      <w:r>
-        <w:t>ATR(</w:t>
-      </w:r>
-      <w:proofErr w:type="gramEnd"/>
-      <w:r>
-        <w:t>14) values.</w:t>
+      <w:r>
+        <w:t>ATR_Average = Average of last 50 ATR(14) values.</w:t>
       </w:r>
     </w:p>
     <w:p>
@@ -6229,21 +5969,8 @@
           <w:numId w:val="141"/>
         </w:numPr>
       </w:pPr>
-      <w:proofErr w:type="spellStart"/>
-      <w:r>
-        <w:t>Minimum_Required</w:t>
-      </w:r>
-      <w:proofErr w:type="spellEnd"/>
-      <w:r>
-        <w:t> = </w:t>
-      </w:r>
-      <w:proofErr w:type="spellStart"/>
-      <w:r>
-        <w:t>ATR_Average</w:t>
-      </w:r>
-      <w:proofErr w:type="spellEnd"/>
-      <w:r>
-        <w:t xml:space="preserve"> × 0.50</w:t>
+      <w:r>
+        <w:t>Minimum_Required = ATR_Average × 0.50</w:t>
       </w:r>
     </w:p>
     <w:p>
@@ -6254,23 +5981,7 @@
         </w:numPr>
       </w:pPr>
       <w:r>
-        <w:t>IF </w:t>
-      </w:r>
-      <w:proofErr w:type="spellStart"/>
-      <w:r>
-        <w:t>ATR_Current</w:t>
-      </w:r>
-      <w:proofErr w:type="spellEnd"/>
-      <w:r>
-        <w:t xml:space="preserve"> &gt; </w:t>
-      </w:r>
-      <w:proofErr w:type="spellStart"/>
-      <w:r>
-        <w:t>Minimum_Required</w:t>
-      </w:r>
-      <w:proofErr w:type="spellEnd"/>
-      <w:r>
-        <w:t>: </w:t>
+        <w:t>IF ATR_Current &gt; Minimum_Required: </w:t>
       </w:r>
       <w:r>
         <w:rPr>
@@ -6597,15 +6308,7 @@
           </w:tcPr>
           <w:p>
             <w:r>
-              <w:t xml:space="preserve">D1 </w:t>
-            </w:r>
-            <w:proofErr w:type="gramStart"/>
-            <w:r>
-              <w:t>ADX(</w:t>
-            </w:r>
-            <w:proofErr w:type="gramEnd"/>
-            <w:r>
-              <w:t>14)</w:t>
+              <w:t>D1 ADX(14)</w:t>
             </w:r>
           </w:p>
         </w:tc>
@@ -6683,6 +6386,7 @@
                 <w:b/>
                 <w:bCs/>
               </w:rPr>
+              <w:lastRenderedPageBreak/>
               <w:t>3. Volatility</w:t>
             </w:r>
           </w:p>
@@ -6701,15 +6405,7 @@
           </w:tcPr>
           <w:p>
             <w:r>
-              <w:t xml:space="preserve">D1 </w:t>
-            </w:r>
-            <w:proofErr w:type="gramStart"/>
-            <w:r>
-              <w:t>ATR(</w:t>
-            </w:r>
-            <w:proofErr w:type="gramEnd"/>
-            <w:r>
-              <w:t>14)</w:t>
+              <w:t>D1 ATR(14)</w:t>
             </w:r>
           </w:p>
         </w:tc>
@@ -6815,7 +6511,6 @@
     </w:p>
     <w:p>
       <w:r>
-        <w:lastRenderedPageBreak/>
         <w:t>Check: Is D1 close &gt; D1 50 EMA?</w:t>
       </w:r>
     </w:p>
@@ -6943,15 +6638,7 @@
     </w:p>
     <w:p>
       <w:r>
-        <w:t xml:space="preserve">After </w:t>
-      </w:r>
-      <w:proofErr w:type="gramStart"/>
-      <w:r>
-        <w:t>all</w:t>
-      </w:r>
-      <w:proofErr w:type="gramEnd"/>
-      <w:r>
-        <w:t xml:space="preserve"> 14 pairs checked:</w:t>
+        <w:t>After all 14 pairs checked:</w:t>
       </w:r>
     </w:p>
     <w:p>
@@ -6989,8 +6676,9 @@
     </w:p>
     <w:p>
       <w:r>
+        <w:lastRenderedPageBreak/>
         <w:pict w14:anchorId="077CC69D">
-          <v:rect id="_x0000_i1239" style="width:0;height:.75pt" o:hralign="center" o:hrstd="t" o:hr="t" fillcolor="#a0a0a0" stroked="f"/>
+          <v:rect id="_x0000_i1033" style="width:0;height:.75pt" o:hralign="center" o:hrstd="t" o:hr="t" fillcolor="#a0a0a0" stroked="f"/>
         </w:pict>
       </w:r>
     </w:p>
@@ -7075,15 +6763,7 @@
         </w:numPr>
       </w:pPr>
       <w:r>
-        <w:t xml:space="preserve">Price </w:t>
-      </w:r>
-      <w:proofErr w:type="gramStart"/>
-      <w:r>
-        <w:t>is showing</w:t>
-      </w:r>
-      <w:proofErr w:type="gramEnd"/>
-      <w:r>
-        <w:t xml:space="preserve"> signs of reversing (bullish pattern).</w:t>
+        <w:t>Price is showing signs of reversing (bullish pattern).</w:t>
       </w:r>
     </w:p>
     <w:p>
@@ -7128,7 +6808,6 @@
           <w:b/>
           <w:bCs/>
         </w:rPr>
-        <w:lastRenderedPageBreak/>
         <w:t>Example:</w:t>
       </w:r>
     </w:p>
@@ -7319,6 +6998,7 @@
           <w:b/>
           <w:bCs/>
         </w:rPr>
+        <w:lastRenderedPageBreak/>
         <w:t>Condition 2: RSI Below 30 (H4)</w:t>
       </w:r>
     </w:p>
@@ -7480,27 +7160,10 @@
           <w:b/>
           <w:bCs/>
         </w:rPr>
-        <w:lastRenderedPageBreak/>
         <w:t>Hammer:</w:t>
       </w:r>
       <w:r>
-        <w:t xml:space="preserve"> Candle with long lower wick (≥2× body), small body, little/no upper </w:t>
-      </w:r>
-      <w:proofErr w:type="gramStart"/>
-      <w:r>
-        <w:t>wick</w:t>
-      </w:r>
-      <w:proofErr w:type="gramEnd"/>
-      <w:r>
-        <w:t xml:space="preserve"> (&lt;0.5× body), and </w:t>
-      </w:r>
-      <w:proofErr w:type="gramStart"/>
-      <w:r>
-        <w:t>closes bullish</w:t>
-      </w:r>
-      <w:proofErr w:type="gramEnd"/>
-      <w:r>
-        <w:t>.</w:t>
+        <w:t> Candle with long lower wick (≥2× body), small body, little/no upper wick (&lt;0.5× body), and closes bullish.</w:t>
       </w:r>
     </w:p>
     <w:p>
@@ -7518,15 +7181,7 @@
         <w:t>Strong Bullish Close:</w:t>
       </w:r>
       <w:r>
-        <w:t xml:space="preserve"> Candle closes in the top 30% of its </w:t>
-      </w:r>
-      <w:proofErr w:type="gramStart"/>
-      <w:r>
-        <w:t>range ((</w:t>
-      </w:r>
-      <w:proofErr w:type="gramEnd"/>
-      <w:r>
-        <w:t>Close - Low) / (High - Low) &gt; 0.70).</w:t>
+        <w:t> Candle closes in the top 30% of its range ((Close - Low) / (High - Low) &gt; 0.70).</w:t>
       </w:r>
     </w:p>
     <w:p>
@@ -7623,7 +7278,7 @@
     <w:p>
       <w:r>
         <w:pict w14:anchorId="58DC17BA">
-          <v:rect id="_x0000_i1240" style="width:0;height:.75pt" o:hralign="center" o:hrstd="t" o:hr="t" fillcolor="#a0a0a0" stroked="f"/>
+          <v:rect id="_x0000_i1034" style="width:0;height:.75pt" o:hralign="center" o:hrstd="t" o:hr="t" fillcolor="#a0a0a0" stroked="f"/>
         </w:pict>
       </w:r>
     </w:p>
@@ -7654,6 +7309,7 @@
           <w:b/>
           <w:bCs/>
         </w:rPr>
+        <w:lastRenderedPageBreak/>
         <w:t>8.1 When Entry Is Triggered</w:t>
       </w:r>
     </w:p>
@@ -7766,34 +7422,10 @@
           <w:b/>
           <w:bCs/>
         </w:rPr>
-        <w:t xml:space="preserve">Why fixed </w:t>
-      </w:r>
-      <w:proofErr w:type="gramStart"/>
-      <w:r>
-        <w:rPr>
-          <w:b/>
-          <w:bCs/>
-        </w:rPr>
-        <w:t>sizing</w:t>
-      </w:r>
-      <w:proofErr w:type="gramEnd"/>
-      <w:r>
-        <w:rPr>
-          <w:b/>
-          <w:bCs/>
-        </w:rPr>
-        <w:t>?</w:t>
-      </w:r>
-      <w:r>
-        <w:t xml:space="preserve"> Simplifies logic, consistent risk, easy to </w:t>
-      </w:r>
-      <w:proofErr w:type="spellStart"/>
-      <w:r>
-        <w:t>backtest</w:t>
-      </w:r>
-      <w:proofErr w:type="spellEnd"/>
-      <w:r>
-        <w:t>.</w:t>
+        <w:t>Why fixed sizing?</w:t>
+      </w:r>
+      <w:r>
+        <w:t> Simplifies logic, consistent risk, easy to backtest.</w:t>
       </w:r>
     </w:p>
     <w:p>
@@ -7817,7 +7449,6 @@
           <w:b/>
           <w:bCs/>
         </w:rPr>
-        <w:lastRenderedPageBreak/>
         <w:t>Price:</w:t>
       </w:r>
       <w:r>
@@ -7834,15 +7465,7 @@
         <w:t>Expected Slippage:</w:t>
       </w:r>
       <w:r>
-        <w:t xml:space="preserve"> 0-3 </w:t>
-      </w:r>
-      <w:proofErr w:type="gramStart"/>
-      <w:r>
-        <w:t>pips</w:t>
-      </w:r>
-      <w:proofErr w:type="gramEnd"/>
-      <w:r>
-        <w:t xml:space="preserve"> typical. If slippage exceeds 3 pips, reject the order and log the error.</w:t>
+        <w:t> 0-3 pips typical. If slippage exceeds 3 pips, reject the order and log the error.</w:t>
       </w:r>
     </w:p>
     <w:p>
@@ -7957,7 +7580,7 @@
     <w:p>
       <w:r>
         <w:pict w14:anchorId="0E87183C">
-          <v:rect id="_x0000_i1241" style="width:0;height:.75pt" o:hralign="center" o:hrstd="t" o:hr="t" fillcolor="#a0a0a0" stroked="f"/>
+          <v:rect id="_x0000_i1035" style="width:0;height:.75pt" o:hralign="center" o:hrstd="t" o:hr="t" fillcolor="#a0a0a0" stroked="f"/>
         </w:pict>
       </w:r>
     </w:p>
@@ -7997,6 +7620,7 @@
           <w:b/>
           <w:bCs/>
         </w:rPr>
+        <w:lastRenderedPageBreak/>
         <w:t>Goal:</w:t>
       </w:r>
       <w:r>
@@ -8047,21 +7671,8 @@
           <w:numId w:val="150"/>
         </w:numPr>
       </w:pPr>
-      <w:proofErr w:type="spellStart"/>
-      <w:r>
-        <w:t>ATR_Value</w:t>
-      </w:r>
-      <w:proofErr w:type="spellEnd"/>
-      <w:r>
-        <w:t xml:space="preserve"> = </w:t>
-      </w:r>
-      <w:proofErr w:type="gramStart"/>
-      <w:r>
-        <w:t>ATR(</w:t>
-      </w:r>
-      <w:proofErr w:type="gramEnd"/>
-      <w:r>
-        <w:t>14) on 4-Hour chart at time of entry.</w:t>
+      <w:r>
+        <w:t>ATR_Value = ATR(14) on 4-Hour chart at time of entry.</w:t>
       </w:r>
     </w:p>
     <w:p>
@@ -8071,19 +7682,9 @@
           <w:numId w:val="150"/>
         </w:numPr>
       </w:pPr>
-      <w:proofErr w:type="spellStart"/>
-      <w:r>
-        <w:t>Stop_Loss_Distance</w:t>
-      </w:r>
-      <w:proofErr w:type="spellEnd"/>
-      <w:r>
-        <w:t> = 2.0 × </w:t>
-      </w:r>
-      <w:proofErr w:type="spellStart"/>
-      <w:r>
-        <w:t>ATR_Value</w:t>
-      </w:r>
-      <w:proofErr w:type="spellEnd"/>
+      <w:r>
+        <w:t>Stop_Loss_Distance = 2.0 × ATR_Value</w:t>
+      </w:r>
     </w:p>
     <w:p>
       <w:pPr>
@@ -8092,27 +7693,9 @@
           <w:numId w:val="150"/>
         </w:numPr>
       </w:pPr>
-      <w:proofErr w:type="spellStart"/>
-      <w:r>
-        <w:t>Stop_Loss_Price</w:t>
-      </w:r>
-      <w:proofErr w:type="spellEnd"/>
-      <w:r>
-        <w:t> = </w:t>
-      </w:r>
-      <w:proofErr w:type="spellStart"/>
-      <w:r>
-        <w:t>Entry_Price</w:t>
-      </w:r>
-      <w:proofErr w:type="spellEnd"/>
-      <w:r>
-        <w:t> - </w:t>
-      </w:r>
-      <w:proofErr w:type="spellStart"/>
-      <w:r>
-        <w:t>Stop_Loss_Distance</w:t>
-      </w:r>
-      <w:proofErr w:type="spellEnd"/>
+      <w:r>
+        <w:t>Stop_Loss_Price = Entry_Price - Stop_Loss_Distance</w:t>
+      </w:r>
     </w:p>
     <w:p>
       <w:pPr>
@@ -8162,7 +7745,6 @@
           <w:b/>
           <w:bCs/>
         </w:rPr>
-        <w:lastRenderedPageBreak/>
         <w:t>CRITICAL RULE:</w:t>
       </w:r>
       <w:r>
@@ -8208,7 +7790,7 @@
     <w:p>
       <w:r>
         <w:pict w14:anchorId="6FB96B38">
-          <v:rect id="_x0000_i1242" style="width:0;height:.75pt" o:hralign="center" o:hrstd="t" o:hr="t" fillcolor="#a0a0a0" stroked="f"/>
+          <v:rect id="_x0000_i1036" style="width:0;height:.75pt" o:hralign="center" o:hrstd="t" o:hr="t" fillcolor="#a0a0a0" stroked="f"/>
         </w:pict>
       </w:r>
     </w:p>
@@ -8298,27 +7880,9 @@
           <w:numId w:val="151"/>
         </w:numPr>
       </w:pPr>
-      <w:proofErr w:type="spellStart"/>
-      <w:r>
-        <w:t>Risk_Distance</w:t>
-      </w:r>
-      <w:proofErr w:type="spellEnd"/>
-      <w:r>
-        <w:t> = </w:t>
-      </w:r>
-      <w:proofErr w:type="spellStart"/>
-      <w:r>
-        <w:t>Entry_Price</w:t>
-      </w:r>
-      <w:proofErr w:type="spellEnd"/>
-      <w:r>
-        <w:t> - </w:t>
-      </w:r>
-      <w:proofErr w:type="spellStart"/>
-      <w:r>
-        <w:t>Stop_Loss_Price</w:t>
-      </w:r>
-      <w:proofErr w:type="spellEnd"/>
+      <w:r>
+        <w:t>Risk_Distance = Entry_Price - Stop_Loss_Price</w:t>
+      </w:r>
     </w:p>
     <w:p>
       <w:pPr>
@@ -8327,21 +7891,8 @@
           <w:numId w:val="151"/>
         </w:numPr>
       </w:pPr>
-      <w:proofErr w:type="spellStart"/>
-      <w:r>
-        <w:t>Take_Profit_Distance</w:t>
-      </w:r>
-      <w:proofErr w:type="spellEnd"/>
-      <w:r>
-        <w:t> = </w:t>
-      </w:r>
-      <w:proofErr w:type="spellStart"/>
-      <w:r>
-        <w:t>Risk_Distance</w:t>
-      </w:r>
-      <w:proofErr w:type="spellEnd"/>
-      <w:r>
-        <w:t> × 1.5</w:t>
+      <w:r>
+        <w:t>Take_Profit_Distance = Risk_Distance × 1.5</w:t>
       </w:r>
     </w:p>
     <w:p>
@@ -8351,27 +7902,9 @@
           <w:numId w:val="151"/>
         </w:numPr>
       </w:pPr>
-      <w:proofErr w:type="spellStart"/>
-      <w:r>
-        <w:t>Take_Profit_Price</w:t>
-      </w:r>
-      <w:proofErr w:type="spellEnd"/>
-      <w:r>
-        <w:t> = </w:t>
-      </w:r>
-      <w:proofErr w:type="spellStart"/>
-      <w:r>
-        <w:t>Entry_Price</w:t>
-      </w:r>
-      <w:proofErr w:type="spellEnd"/>
-      <w:r>
-        <w:t> + </w:t>
-      </w:r>
-      <w:proofErr w:type="spellStart"/>
-      <w:r>
-        <w:t>Take_Profit_Distance</w:t>
-      </w:r>
-      <w:proofErr w:type="spellEnd"/>
+      <w:r>
+        <w:t>Take_Profit_Price = Entry_Price + Take_Profit_Distance</w:t>
+      </w:r>
     </w:p>
     <w:p>
       <w:pPr>
@@ -8403,7 +7936,7 @@
     <w:p>
       <w:r>
         <w:pict w14:anchorId="375330BD">
-          <v:rect id="_x0000_i1243" style="width:0;height:.75pt" o:hralign="center" o:hrstd="t" o:hr="t" fillcolor="#a0a0a0" stroked="f"/>
+          <v:rect id="_x0000_i1037" style="width:0;height:.75pt" o:hralign="center" o:hrstd="t" o:hr="t" fillcolor="#a0a0a0" stroked="f"/>
         </w:pict>
       </w:r>
     </w:p>
@@ -8434,6 +7967,7 @@
           <w:b/>
           <w:bCs/>
         </w:rPr>
+        <w:lastRenderedPageBreak/>
         <w:t>11.1 The Four Exit Methods</w:t>
       </w:r>
     </w:p>
@@ -8503,15 +8037,7 @@
         <w:t>Bollinger Band Exit</w:t>
       </w:r>
       <w:r>
-        <w:t xml:space="preserve"> - Mean </w:t>
-      </w:r>
-      <w:proofErr w:type="gramStart"/>
-      <w:r>
-        <w:t>reversion complete</w:t>
-      </w:r>
-      <w:proofErr w:type="gramEnd"/>
-      <w:r>
-        <w:t>.</w:t>
+        <w:t> - Mean reversion complete.</w:t>
       </w:r>
     </w:p>
     <w:p>
@@ -8529,15 +8055,7 @@
         <w:t>Time-Based Exit</w:t>
       </w:r>
       <w:r>
-        <w:t xml:space="preserve"> - </w:t>
-      </w:r>
-      <w:proofErr w:type="gramStart"/>
-      <w:r>
-        <w:t>Maximum hold</w:t>
-      </w:r>
-      <w:proofErr w:type="gramEnd"/>
-      <w:r>
-        <w:t xml:space="preserve"> period (20 days) exceeded.</w:t>
+        <w:t> - Maximum hold period (20 days) exceeded.</w:t>
       </w:r>
     </w:p>
     <w:p>
@@ -8571,23 +8089,7 @@
       </w:r>
       <w:r>
         <w:br/>
-        <w:t>IF (H4_Close &gt; H4_Middle_Bollinger_Band) AND (</w:t>
-      </w:r>
-      <w:proofErr w:type="spellStart"/>
-      <w:r>
-        <w:t>Position_Profit</w:t>
-      </w:r>
-      <w:proofErr w:type="spellEnd"/>
-      <w:r>
-        <w:t xml:space="preserve"> &gt; 0 OR </w:t>
-      </w:r>
-      <w:proofErr w:type="spellStart"/>
-      <w:r>
-        <w:t>Days_Open</w:t>
-      </w:r>
-      <w:proofErr w:type="spellEnd"/>
-      <w:r>
-        <w:t xml:space="preserve"> &gt;= 5):</w:t>
+        <w:t>IF (H4_Close &gt; H4_Middle_Bollinger_Band) AND (Position_Profit &gt; 0 OR Days_Open &gt;= 5):</w:t>
       </w:r>
       <w:r>
         <w:br/>
@@ -8612,7 +8114,6 @@
           <w:b/>
           <w:bCs/>
         </w:rPr>
-        <w:lastRenderedPageBreak/>
         <w:t>11.3 Time-Based Exit Rule</w:t>
       </w:r>
     </w:p>
@@ -8638,43 +8139,11 @@
         <w:t>Calculation:</w:t>
       </w:r>
       <w:r>
-        <w:t> </w:t>
-      </w:r>
-      <w:proofErr w:type="spellStart"/>
-      <w:r>
-        <w:t>Days_Open</w:t>
-      </w:r>
-      <w:proofErr w:type="spellEnd"/>
-      <w:r>
-        <w:t xml:space="preserve"> = (</w:t>
-      </w:r>
-      <w:proofErr w:type="spellStart"/>
-      <w:r>
-        <w:t>Current_Time</w:t>
-      </w:r>
-      <w:proofErr w:type="spellEnd"/>
-      <w:r>
-        <w:t xml:space="preserve"> - </w:t>
-      </w:r>
-      <w:proofErr w:type="spellStart"/>
-      <w:r>
-        <w:t>Entry_Time</w:t>
-      </w:r>
-      <w:proofErr w:type="spellEnd"/>
-      <w:r>
-        <w:t>) / 86400 seconds</w:t>
+        <w:t> Days_Open = (Current_Time - Entry_Time) / 86400 seconds</w:t>
       </w:r>
       <w:r>
         <w:br/>
-        <w:t>IF </w:t>
-      </w:r>
-      <w:proofErr w:type="spellStart"/>
-      <w:r>
-        <w:t>Days_Open</w:t>
-      </w:r>
-      <w:proofErr w:type="spellEnd"/>
-      <w:r>
-        <w:t xml:space="preserve"> &gt;= 20: </w:t>
+        <w:t>IF Days_Open &gt;= 20: </w:t>
       </w:r>
       <w:r>
         <w:rPr>
@@ -8690,7 +8159,7 @@
     <w:p>
       <w:r>
         <w:pict w14:anchorId="0D81A3FF">
-          <v:rect id="_x0000_i1244" style="width:0;height:.75pt" o:hralign="center" o:hrstd="t" o:hr="t" fillcolor="#a0a0a0" stroked="f"/>
+          <v:rect id="_x0000_i1038" style="width:0;height:.75pt" o:hralign="center" o:hrstd="t" o:hr="t" fillcolor="#a0a0a0" stroked="f"/>
         </w:pict>
       </w:r>
     </w:p>
@@ -8867,56 +8336,18 @@
       </w:r>
       <w:r>
         <w:br/>
-        <w:t>IF (</w:t>
-      </w:r>
-      <w:proofErr w:type="spellStart"/>
-      <w:r>
-        <w:t>Days_Open</w:t>
-      </w:r>
-      <w:proofErr w:type="spellEnd"/>
-      <w:r>
-        <w:t xml:space="preserve"> &gt;= 5) AND (</w:t>
-      </w:r>
-      <w:proofErr w:type="spellStart"/>
-      <w:r>
-        <w:t>Current_Price</w:t>
-      </w:r>
-      <w:proofErr w:type="spellEnd"/>
-      <w:r>
-        <w:t xml:space="preserve"> &gt; </w:t>
-      </w:r>
-      <w:proofErr w:type="spellStart"/>
-      <w:r>
-        <w:t>Entry_Price</w:t>
-      </w:r>
-      <w:proofErr w:type="spellEnd"/>
-      <w:r>
-        <w:t xml:space="preserve"> + (1.0 × H4_ATR)):</w:t>
+        <w:t>IF (Days_Open &gt;= 5) AND (Current_Price &gt; Entry_Price + (1.0 × H4_ATR)):</w:t>
       </w:r>
       <w:r>
         <w:br/>
-      </w:r>
-      <w:proofErr w:type="spellStart"/>
-      <w:r>
-        <w:t>New_Stop_Loss</w:t>
-      </w:r>
-      <w:proofErr w:type="spellEnd"/>
-      <w:r>
-        <w:t xml:space="preserve"> = </w:t>
-      </w:r>
-      <w:proofErr w:type="spellStart"/>
-      <w:r>
-        <w:t>Entry_Price</w:t>
-      </w:r>
-      <w:proofErr w:type="spellEnd"/>
-      <w:r>
-        <w:t xml:space="preserve"> + 2_pips_buffer</w:t>
-      </w:r>
-    </w:p>
-    <w:p>
-      <w:r>
+        <w:t>New_Stop_Loss = Entry_Price + 2_pips_buffer</w:t>
+      </w:r>
+    </w:p>
+    <w:p>
+      <w:r>
+        <w:lastRenderedPageBreak/>
         <w:pict w14:anchorId="417D1F3D">
-          <v:rect id="_x0000_i1245" style="width:0;height:.75pt" o:hralign="center" o:hrstd="t" o:hr="t" fillcolor="#a0a0a0" stroked="f"/>
+          <v:rect id="_x0000_i1039" style="width:0;height:.75pt" o:hralign="center" o:hrstd="t" o:hr="t" fillcolor="#a0a0a0" stroked="f"/>
         </w:pict>
       </w:r>
     </w:p>
@@ -9033,7 +8464,6 @@
           <w:b/>
           <w:bCs/>
         </w:rPr>
-        <w:lastRenderedPageBreak/>
         <w:t>Rule:</w:t>
       </w:r>
       <w:r>
@@ -9189,31 +8619,7 @@
         <w:t>Calculation:</w:t>
       </w:r>
       <w:r>
-        <w:t> </w:t>
-      </w:r>
-      <w:proofErr w:type="spellStart"/>
-      <w:r>
-        <w:t>Daily_Loss</w:t>
-      </w:r>
-      <w:proofErr w:type="spellEnd"/>
-      <w:r>
-        <w:t xml:space="preserve"> = Sum of all CLOSED losing trades today. IF </w:t>
-      </w:r>
-      <w:proofErr w:type="spellStart"/>
-      <w:r>
-        <w:t>Daily_Loss</w:t>
-      </w:r>
-      <w:proofErr w:type="spellEnd"/>
-      <w:r>
-        <w:t xml:space="preserve"> &gt; (</w:t>
-      </w:r>
-      <w:proofErr w:type="spellStart"/>
-      <w:r>
-        <w:t>Account_Balance</w:t>
-      </w:r>
-      <w:proofErr w:type="spellEnd"/>
-      <w:r>
-        <w:t xml:space="preserve"> × 0.03): </w:t>
+        <w:t> Daily_Loss = Sum of all CLOSED losing trades today. IF Daily_Loss &gt; (Account_Balance × 0.03): </w:t>
       </w:r>
       <w:r>
         <w:rPr>
@@ -9279,7 +8685,7 @@
     <w:p>
       <w:r>
         <w:pict w14:anchorId="78244A70">
-          <v:rect id="_x0000_i1246" style="width:0;height:.75pt" o:hralign="center" o:hrstd="t" o:hr="t" fillcolor="#a0a0a0" stroked="f"/>
+          <v:rect id="_x0000_i1040" style="width:0;height:.75pt" o:hralign="center" o:hrstd="t" o:hr="t" fillcolor="#a0a0a0" stroked="f"/>
         </w:pict>
       </w:r>
     </w:p>
@@ -9343,6 +8749,7 @@
           <w:b/>
           <w:bCs/>
         </w:rPr>
+        <w:lastRenderedPageBreak/>
         <w:t>00:05 GMT:</w:t>
       </w:r>
       <w:r>
@@ -9423,7 +8830,7 @@
     <w:p>
       <w:r>
         <w:pict w14:anchorId="23489E61">
-          <v:rect id="_x0000_i1247" style="width:0;height:.75pt" o:hralign="center" o:hrstd="t" o:hr="t" fillcolor="#a0a0a0" stroked="f"/>
+          <v:rect id="_x0000_i1041" style="width:0;height:.75pt" o:hralign="center" o:hrstd="t" o:hr="t" fillcolor="#a0a0a0" stroked="f"/>
         </w:pict>
       </w:r>
     </w:p>
@@ -9463,7 +8870,6 @@
           <w:b/>
           <w:bCs/>
         </w:rPr>
-        <w:lastRenderedPageBreak/>
         <w:t>15.1 Example 1: Successful Trade (TP Hit)</w:t>
       </w:r>
     </w:p>
@@ -9530,7 +8936,7 @@
     <w:p>
       <w:r>
         <w:pict w14:anchorId="33F0B419">
-          <v:rect id="_x0000_i1248" style="width:0;height:.75pt" o:hralign="center" o:hrstd="t" o:hr="t" fillcolor="#a0a0a0" stroked="f"/>
+          <v:rect id="_x0000_i1042" style="width:0;height:.75pt" o:hralign="center" o:hrstd="t" o:hr="t" fillcolor="#a0a0a0" stroked="f"/>
         </w:pict>
       </w:r>
     </w:p>
@@ -9633,15 +9039,7 @@
         <w:t>State 4: NO APPROVED PAIRS</w:t>
       </w:r>
       <w:r>
-        <w:t xml:space="preserve"> - D1 filter approved zero pairs, system </w:t>
-      </w:r>
-      <w:proofErr w:type="gramStart"/>
-      <w:r>
-        <w:t>idles</w:t>
-      </w:r>
-      <w:proofErr w:type="gramEnd"/>
-      <w:r>
-        <w:t>.</w:t>
+        <w:t> - D1 filter approved zero pairs, system idles.</w:t>
       </w:r>
     </w:p>
     <w:p>
@@ -9665,7 +9063,7 @@
     <w:p>
       <w:r>
         <w:pict w14:anchorId="3439FA26">
-          <v:rect id="_x0000_i1249" style="width:0;height:.75pt" o:hralign="center" o:hrstd="t" o:hr="t" fillcolor="#a0a0a0" stroked="f"/>
+          <v:rect id="_x0000_i1043" style="width:0;height:.75pt" o:hralign="center" o:hrstd="t" o:hr="t" fillcolor="#a0a0a0" stroked="f"/>
         </w:pict>
       </w:r>
     </w:p>
@@ -9729,6 +9127,7 @@
           <w:b/>
           <w:bCs/>
         </w:rPr>
+        <w:lastRenderedPageBreak/>
         <w:t>Invalid Stop Distance:</w:t>
       </w:r>
       <w:r>
@@ -9750,15 +9149,7 @@
         <w:t>Order Execution Timeout:</w:t>
       </w:r>
       <w:r>
-        <w:t xml:space="preserve"> Check if filled, if not cancel and </w:t>
-      </w:r>
-      <w:proofErr w:type="gramStart"/>
-      <w:r>
-        <w:t>log</w:t>
-      </w:r>
-      <w:proofErr w:type="gramEnd"/>
-      <w:r>
-        <w:t xml:space="preserve"> error.</w:t>
+        <w:t> Check if filled, if not cancel and log error.</w:t>
       </w:r>
     </w:p>
     <w:p>
@@ -9827,15 +9218,7 @@
         <w:t>All 14 Pairs Blocked:</w:t>
       </w:r>
       <w:r>
-        <w:t xml:space="preserve"> System </w:t>
-      </w:r>
-      <w:proofErr w:type="gramStart"/>
-      <w:r>
-        <w:t>idles</w:t>
-      </w:r>
-      <w:proofErr w:type="gramEnd"/>
-      <w:r>
-        <w:t xml:space="preserve"> for the day.</w:t>
+        <w:t> System idles for the day.</w:t>
       </w:r>
     </w:p>
     <w:p>
@@ -9859,7 +9242,7 @@
     <w:p>
       <w:r>
         <w:pict w14:anchorId="2F3E6031">
-          <v:rect id="_x0000_i1250" style="width:0;height:.75pt" o:hralign="center" o:hrstd="t" o:hr="t" fillcolor="#a0a0a0" stroked="f"/>
+          <v:rect id="_x0000_i1044" style="width:0;height:.75pt" o:hralign="center" o:hrstd="t" o:hr="t" fillcolor="#a0a0a0" stroked="f"/>
         </w:pict>
       </w:r>
     </w:p>
@@ -9890,24 +9273,7 @@
           <w:b/>
           <w:bCs/>
         </w:rPr>
-        <w:lastRenderedPageBreak/>
-        <w:t xml:space="preserve">18.1 Realistic Metrics (Based on </w:t>
-      </w:r>
-      <w:proofErr w:type="spellStart"/>
-      <w:r>
-        <w:rPr>
-          <w:b/>
-          <w:bCs/>
-        </w:rPr>
-        <w:t>Backtesting</w:t>
-      </w:r>
-      <w:proofErr w:type="spellEnd"/>
-      <w:r>
-        <w:rPr>
-          <w:b/>
-          <w:bCs/>
-        </w:rPr>
-        <w:t>)</w:t>
+        <w:t>18.1 Realistic Metrics (Based on Backtesting)</w:t>
       </w:r>
     </w:p>
     <w:tbl>
@@ -10513,7 +9879,7 @@
     <w:p>
       <w:r>
         <w:pict w14:anchorId="06FD1038">
-          <v:rect id="_x0000_i1251" style="width:0;height:.75pt" o:hralign="center" o:hrstd="t" o:hr="t" fillcolor="#a0a0a0" stroked="f"/>
+          <v:rect id="_x0000_i1045" style="width:0;height:.75pt" o:hralign="center" o:hrstd="t" o:hr="t" fillcolor="#a0a0a0" stroked="f"/>
         </w:pict>
       </w:r>
     </w:p>
@@ -10570,6 +9936,7 @@
           <w:b/>
           <w:bCs/>
         </w:rPr>
+        <w:lastRenderedPageBreak/>
         <w:t>19.2 Integration Testing</w:t>
       </w:r>
     </w:p>
@@ -10596,23 +9963,7 @@
           <w:b/>
           <w:bCs/>
         </w:rPr>
-        <w:t xml:space="preserve">19.3 </w:t>
-      </w:r>
-      <w:proofErr w:type="spellStart"/>
-      <w:r>
-        <w:rPr>
-          <w:b/>
-          <w:bCs/>
-        </w:rPr>
-        <w:t>Backtesting</w:t>
-      </w:r>
-      <w:proofErr w:type="spellEnd"/>
-      <w:r>
-        <w:rPr>
-          <w:b/>
-          <w:bCs/>
-        </w:rPr>
-        <w:t xml:space="preserve"> Requirements</w:t>
+        <w:t>19.3 Backtesting Requirements</w:t>
       </w:r>
     </w:p>
     <w:p>
@@ -10648,15 +9999,7 @@
         <w:t>Data:</w:t>
       </w:r>
       <w:r>
-        <w:t xml:space="preserve"> All 14 pairs, D1 &amp; H4, </w:t>
-      </w:r>
-      <w:proofErr w:type="gramStart"/>
-      <w:r>
-        <w:t>includes</w:t>
-      </w:r>
-      <w:proofErr w:type="gramEnd"/>
-      <w:r>
-        <w:t xml:space="preserve"> spreads/commissions.</w:t>
+        <w:t> All 14 pairs, D1 &amp; H4, includes spreads/commissions.</w:t>
       </w:r>
     </w:p>
     <w:p>
@@ -10722,7 +10065,6 @@
           <w:b/>
           <w:bCs/>
         </w:rPr>
-        <w:lastRenderedPageBreak/>
         <w:t>Phase 2: Live Micro Account</w:t>
       </w:r>
       <w:r>
@@ -10732,7 +10074,7 @@
     <w:p>
       <w:r>
         <w:pict w14:anchorId="3563F4B5">
-          <v:rect id="_x0000_i1252" style="width:0;height:.75pt" o:hralign="center" o:hrstd="t" o:hr="t" fillcolor="#a0a0a0" stroked="f"/>
+          <v:rect id="_x0000_i1046" style="width:0;height:.75pt" o:hralign="center" o:hrstd="t" o:hr="t" fillcolor="#a0a0a0" stroked="f"/>
         </w:pict>
       </w:r>
     </w:p>
@@ -10880,7 +10222,7 @@
     <w:p>
       <w:r>
         <w:pict w14:anchorId="56AF9EB7">
-          <v:rect id="_x0000_i1253" style="width:0;height:.75pt" o:hralign="center" o:hrstd="t" o:hr="t" fillcolor="#a0a0a0" stroked="f"/>
+          <v:rect id="_x0000_i1047" style="width:0;height:.75pt" o:hralign="center" o:hrstd="t" o:hr="t" fillcolor="#a0a0a0" stroked="f"/>
         </w:pict>
       </w:r>
     </w:p>
@@ -10945,21 +10287,12 @@
       </w:r>
     </w:p>
     <w:p>
-      <w:proofErr w:type="gramStart"/>
-      <w:r>
-        <w:rPr>
-          <w:b/>
-          <w:bCs/>
-        </w:rPr>
-        <w:t>Approvals</w:t>
-      </w:r>
-      <w:proofErr w:type="gramEnd"/>
-      <w:r>
-        <w:rPr>
-          <w:b/>
-          <w:bCs/>
-        </w:rPr>
-        <w:t>:</w:t>
+      <w:r>
+        <w:rPr>
+          <w:b/>
+          <w:bCs/>
+        </w:rPr>
+        <w:t>Approvals:</w:t>
       </w:r>
     </w:p>
     <w:p>
@@ -10992,6 +10325,7 @@
           <w:b/>
           <w:bCs/>
         </w:rPr>
+        <w:lastRenderedPageBreak/>
         <w:t>Lead Developer:</w:t>
       </w:r>
       <w:r>
@@ -11031,7 +10365,7 @@
     <w:p>
       <w:r>
         <w:pict w14:anchorId="2A68BFF4">
-          <v:rect id="_x0000_i1254" style="width:0;height:.75pt" o:hralign="center" o:hrstd="t" o:hr="t" fillcolor="#a0a0a0" stroked="f"/>
+          <v:rect id="_x0000_i1048" style="width:0;height:.75pt" o:hralign="center" o:hrstd="t" o:hr="t" fillcolor="#a0a0a0" stroked="f"/>
         </w:pict>
       </w:r>
     </w:p>
@@ -11068,7 +10402,6 @@
           <w:b/>
           <w:bCs/>
         </w:rPr>
-        <w:lastRenderedPageBreak/>
         <w:t>Any ambiguities or questions should be resolved through formal change request process.</w:t>
       </w:r>
     </w:p>
@@ -36208,6 +35541,7 @@
   <w:style w:type="character" w:default="1" w:styleId="DefaultParagraphFont">
     <w:name w:val="Default Paragraph Font"/>
     <w:uiPriority w:val="1"/>
+    <w:semiHidden/>
     <w:unhideWhenUsed/>
   </w:style>
   <w:style w:type="table" w:default="1" w:styleId="TableNormal">

</xml_diff>